<commit_message>
Kahraman tanıtımları: kullanıcı düzenlemeleri (Drazhen unvanı, Stanimir, Saelith, Vesper sözleri)
Co-Authored-By: Claude Sonnet 5.5 <noreply@anthropic.com>
Claude-Session: https://claude.ai/code/session_01USw2EQBrdqEKnD9pXcm6bm
</commit_message>
<xml_diff>
--- a/docs/kahraman-tanitimlari.docx
+++ b/docs/kahraman-tanitimlari.docx
@@ -130,7 +130,7 @@
           <w:sz w:val="22"/>
           <w:szCs w:val="22"/>
         </w:rPr>
-        <w:t xml:space="preserve">Kiralık El Arbaleti  |  Çift Okçu</w:t>
+        <w:t xml:space="preserve">Kiralık Ok  |  Çift Okçu</w:t>
       </w:r>
     </w:p>
     <w:p>
@@ -282,7 +282,7 @@
           <w:sz w:val="22"/>
           <w:szCs w:val="22"/>
         </w:rPr>
-        <w:t xml:space="preserve">"Ben dövüşmem. Hüküm veririm."</w:t>
+        <w:t xml:space="preserve">"Ben dövüşürüm. Hüküm onlar verir."</w:t>
       </w:r>
     </w:p>
     <w:p>
@@ -480,7 +480,7 @@
           <w:sz w:val="22"/>
           <w:szCs w:val="22"/>
         </w:rPr>
-        <w:t xml:space="preserve">"Işık her şeyi gösterir. Ateş her şeye cevap verir."</w:t>
+        <w:t xml:space="preserve">"Işık her şeyi gösterirdi ama cevabı göstermiyor."</w:t>
       </w:r>
     </w:p>
     <w:p>
@@ -678,7 +678,7 @@
           <w:sz w:val="22"/>
           <w:szCs w:val="22"/>
         </w:rPr>
-        <w:t xml:space="preserve">"Bana ad verirseniz, ertesi gün unutursunuz."</w:t>
+        <w:t xml:space="preserve">"Kimse beni tanımaz, ben dahil."</w:t>
       </w:r>
     </w:p>
     <w:p>

</xml_diff>

<commit_message>
Alerion: artifakt buz yayı; splash v3, hikâye ve docx güncellendi
Co-Authored-By: Claude Fable 5.1 <noreply@anthropic.com>
Claude-Session: https://claude.ai/code/session_01USw2EQBrdqEKnD9pXcm6bm
</commit_message>
<xml_diff>
--- a/docs/kahraman-tanitimlari.docx
+++ b/docs/kahraman-tanitimlari.docx
@@ -64,7 +64,7 @@
           <w:sz w:val="22"/>
           <w:szCs w:val="22"/>
         </w:rPr>
-        <w:t xml:space="preserve">Buz Okunun Taşıyıcısı  |  Okçu</w:t>
+        <w:t xml:space="preserve">Buz Yayının Taşıyıcısı  |  Okçu</w:t>
       </w:r>
     </w:p>
     <w:p>
@@ -84,7 +84,7 @@
           <w:sz w:val="22"/>
           <w:szCs w:val="22"/>
         </w:rPr>
-        <w:t xml:space="preserve">"Eskiden hedefi ben seçerdim. Şimdi ok seçiyor, ben de ona bakmayı öğrendim."</w:t>
+        <w:t xml:space="preserve">"Eskiden hedefi ben seçerdim. Şimdi yay seçiyor, ben de ona bakmayı öğrendim."</w:t>
       </w:r>
     </w:p>
     <w:p>
@@ -98,7 +98,7 @@
           <w:sz w:val="22"/>
           <w:szCs w:val="22"/>
         </w:rPr>
-        <w:t xml:space="preserve">Elf Federasyonu'nda doğan Alerion, yüzyılını doldurmadan adını efsaneye çevirmeye çıkmış, yeteneğine kendinden başka kimseyi layık görmeyen gösterişli bir maceracıydı. Yolu kuzeye düştüğünde buzun altında uyuyan bir ok buldu: soğuk, sessiz ve kendi iradesi olan bir artifakt. Ok onu ilk kez, Alerion'un varlığından bile habersiz olduğu bir kötülüğe doğru çekti ve o gün ilk kez hedefine kendisi değil ok karar verdi. Şimdilerde Alerion, tam olarak neyi durdurması gerektiğini arıyor. Aradığını bulana dek de yolda gördüğü her kötülüğün önüne çıkıyor, çünkü soğuk bir okun taşıyıcısı için durmak, bir şeyi kaçırmak demek.</w:t>
+        <w:t xml:space="preserve">Elf Federasyonu'nda doğan Alerion, yüzyılını doldurmadan adını efsaneye çevirmeye çıkmış, yeteneğine kendinden başka kimseyi layık görmeyen gösterişli bir maceracıydı. Yolu kuzeye düştüğünde buzun altında uyuyan bir yay buldu: soğuk, sessiz ve kendi iradesi olan bir artifakt. Yay onu ilk kez, Alerion'un varlığından bile habersiz olduğu bir kötülüğe doğru çekti ve o gün ilk kez hedefine kendisi değil yay karar verdi. O günden beri yayı tutan kolu yavaş yavaş buzlanıyor; kırağı her seferinde biraz daha yukarı tırmanıyor ve kolun kime ait olduğu her atışta yeniden pazarlık konusu. Şimdilerde Alerion, tam olarak neyi durdurması gerektiğini arıyor. Aradığını bulana dek de yolda gördüğü her kötülüğün önüne çıkıyor, çünkü soğuk bir yayın taşıyıcısı için durmak, bir şeyi kaçırmak demek.</w:t>
       </w:r>
     </w:p>
     <w:p>

</xml_diff>